<commit_message>
feat(android): first-run server pairing, in-app API key entry, release APK workflow
- first-run screen asks for the server address (the built-in address is the emulator's)
- KeysApi/KeysForm send Groq/OpenRouter keys to the paired server's PUT /settings/keys;
  refused over cleartext to a public address, warned on private networks
- build.gradle.kts: version from -PkairosVersion, optional stable signing from KAIROS_KEYSTORE*
- build-android.yml builds, verifies and attaches Kairos-Android-<version>.apk to a release
- 22 new JVM tests; README, android/README, desktop-app chapter and CLAUDE.md updated

Co-Authored-By: Claude Sonnet 5.5 <noreply@anthropic.com>
</commit_message>
<xml_diff>
--- a/docs/14_desktop_app.docx
+++ b/docs/14_desktop_app.docx
@@ -1316,6 +1316,215 @@
         <w:t xml:space="preserve"> (the workflow, spec and installer script stay valid).</w:t>
       </w:r>
     </w:p>
+    <w:p>
+      <w:pPr>
+        <w:pStyle w:val="Heading2"/>
+      </w:pPr>
+      <w:r>
+        <w:t>9. The Android APK</w:t>
+      </w:r>
+    </w:p>
+    <w:p>
+      <w:r>
+        <w:rPr>
+          <w:b w:val="0"/>
+        </w:rPr>
+        <w:t xml:space="preserve">The Android app is a remote for a Kairos server, because the agent (Python) runs on a computer, not on the phone. The release APK </w:t>
+      </w:r>
+      <w:r>
+        <w:rPr>
+          <w:rFonts w:ascii="Consolas" w:hAnsi="Consolas" w:eastAsia="Consolas"/>
+          <w:sz w:val="19"/>
+        </w:rPr>
+        <w:t>Kairos-Android-&lt;version&gt;.apk</w:t>
+      </w:r>
+      <w:r>
+        <w:rPr>
+          <w:b w:val="0"/>
+        </w:rPr>
+        <w:t xml:space="preserve"> is built by </w:t>
+      </w:r>
+      <w:r>
+        <w:rPr>
+          <w:rFonts w:ascii="Consolas" w:hAnsi="Consolas" w:eastAsia="Consolas"/>
+          <w:sz w:val="19"/>
+        </w:rPr>
+        <w:t>.github/workflows/build-android.yml</w:t>
+      </w:r>
+      <w:r>
+        <w:rPr>
+          <w:b w:val="0"/>
+        </w:rPr>
+        <w:t xml:space="preserve">: it runs the 143 JVM tests, builds the app with the version taken from the release tag, checks the package with </w:t>
+      </w:r>
+      <w:r>
+        <w:rPr>
+          <w:rFonts w:ascii="Consolas" w:hAnsi="Consolas" w:eastAsia="Consolas"/>
+          <w:sz w:val="19"/>
+        </w:rPr>
+        <w:t>aapt2</w:t>
+      </w:r>
+      <w:r>
+        <w:rPr>
+          <w:b w:val="0"/>
+        </w:rPr>
+        <w:t xml:space="preserve"> and </w:t>
+      </w:r>
+      <w:r>
+        <w:rPr>
+          <w:rFonts w:ascii="Consolas" w:hAnsi="Consolas" w:eastAsia="Consolas"/>
+          <w:sz w:val="19"/>
+        </w:rPr>
+        <w:t>apksigner</w:t>
+      </w:r>
+      <w:r>
+        <w:rPr>
+          <w:b w:val="0"/>
+        </w:rPr>
+        <w:t>, and attaches the file to the release.</w:t>
+      </w:r>
+    </w:p>
+    <w:p>
+      <w:r>
+        <w:rPr>
+          <w:b w:val="0"/>
+        </w:rPr>
+        <w:t xml:space="preserve">First run on a phone: the app asks for the address of the computer running Kairos (for example </w:t>
+      </w:r>
+      <w:r>
+        <w:rPr>
+          <w:rFonts w:ascii="Consolas" w:hAnsi="Consolas" w:eastAsia="Consolas"/>
+          <w:sz w:val="19"/>
+        </w:rPr>
+        <w:t>ws://192.168.1.20:8000</w:t>
+      </w:r>
+      <w:r>
+        <w:rPr>
+          <w:b w:val="0"/>
+        </w:rPr>
+        <w:t xml:space="preserve">) and its access key if it has one. When that server holds no LLM key, the app opens the same API-key form as the desktop UI and sends the key with </w:t>
+      </w:r>
+      <w:r>
+        <w:rPr>
+          <w:rFonts w:ascii="Consolas" w:hAnsi="Consolas" w:eastAsia="Consolas"/>
+          <w:sz w:val="19"/>
+        </w:rPr>
+        <w:t>PUT /settings/keys</w:t>
+      </w:r>
+      <w:r>
+        <w:rPr>
+          <w:b w:val="0"/>
+        </w:rPr>
+        <w:t xml:space="preserve"> (</w:t>
+      </w:r>
+      <w:r>
+        <w:rPr>
+          <w:rFonts w:ascii="Consolas" w:hAnsi="Consolas" w:eastAsia="Consolas"/>
+          <w:sz w:val="19"/>
+        </w:rPr>
+        <w:t>HttpKeysApi</w:t>
+      </w:r>
+      <w:r>
+        <w:rPr>
+          <w:b w:val="0"/>
+        </w:rPr>
+        <w:t xml:space="preserve"> in </w:t>
+      </w:r>
+      <w:r>
+        <w:rPr>
+          <w:rFonts w:ascii="Consolas" w:hAnsi="Consolas" w:eastAsia="Consolas"/>
+          <w:sz w:val="19"/>
+        </w:rPr>
+        <w:t>android/app/src/main/java/com/samsung/interruptible/data/KeysApi.kt</w:t>
+      </w:r>
+      <w:r>
+        <w:rPr>
+          <w:b w:val="0"/>
+        </w:rPr>
+        <w:t xml:space="preserve">, form in </w:t>
+      </w:r>
+      <w:r>
+        <w:rPr>
+          <w:rFonts w:ascii="Consolas" w:hAnsi="Consolas" w:eastAsia="Consolas"/>
+          <w:sz w:val="19"/>
+        </w:rPr>
+        <w:t>ui/KeysForm.kt</w:t>
+      </w:r>
+      <w:r>
+        <w:rPr>
+          <w:b w:val="0"/>
+        </w:rPr>
+        <w:t xml:space="preserve">). The server validates the key with the provider and keeps it on the computer. The app refuses to send keys over unencrypted </w:t>
+      </w:r>
+      <w:r>
+        <w:rPr>
+          <w:rFonts w:ascii="Consolas" w:hAnsi="Consolas" w:eastAsia="Consolas"/>
+          <w:sz w:val="19"/>
+        </w:rPr>
+        <w:t>ws://</w:t>
+      </w:r>
+      <w:r>
+        <w:rPr>
+          <w:b w:val="0"/>
+        </w:rPr>
+        <w:t xml:space="preserve"> to a public address and warns on private networks.</w:t>
+      </w:r>
+    </w:p>
+    <w:p>
+      <w:r>
+        <w:rPr>
+          <w:b w:val="0"/>
+        </w:rPr>
+        <w:t xml:space="preserve">Without signing secrets the APK is signed with the CI runner's throwaway key, so a newer build cannot update an older install (uninstall first). Setting the repository secrets </w:t>
+      </w:r>
+      <w:r>
+        <w:rPr>
+          <w:rFonts w:ascii="Consolas" w:hAnsi="Consolas" w:eastAsia="Consolas"/>
+          <w:sz w:val="19"/>
+        </w:rPr>
+        <w:t>ANDROID_KEYSTORE_B64</w:t>
+      </w:r>
+      <w:r>
+        <w:rPr>
+          <w:b w:val="0"/>
+        </w:rPr>
+        <w:t xml:space="preserve"> and </w:t>
+      </w:r>
+      <w:r>
+        <w:rPr>
+          <w:rFonts w:ascii="Consolas" w:hAnsi="Consolas" w:eastAsia="Consolas"/>
+          <w:sz w:val="19"/>
+        </w:rPr>
+        <w:t>ANDROID_KEYSTORE_PASSWORD</w:t>
+      </w:r>
+      <w:r>
+        <w:rPr>
+          <w:b w:val="0"/>
+        </w:rPr>
+        <w:t xml:space="preserve"> gives builds a stable identity.</w:t>
+      </w:r>
+    </w:p>
+    <w:p>
+      <w:r>
+        <w:rPr>
+          <w:b w:val="0"/>
+        </w:rPr>
+        <w:t xml:space="preserve">Tests: </w:t>
+      </w:r>
+      <w:r>
+        <w:rPr>
+          <w:rFonts w:ascii="Consolas" w:hAnsi="Consolas" w:eastAsia="Consolas"/>
+          <w:sz w:val="19"/>
+        </w:rPr>
+        <w:t>KeysTest.kt</w:t>
+      </w:r>
+      <w:r>
+        <w:rPr>
+          <w:b w:val="0"/>
+        </w:rPr>
+        <w:t xml:space="preserve"> (the key client against a mock server, the controller rules, the form, and the first-run flow).</w:t>
+      </w:r>
+    </w:p>
     <w:sectPr>
       <w:pgSz w:w="12240" w:h="15840"/>
       <w:pgMar w:top="1134" w:right="1247" w:bottom="1134" w:left="1247" w:header="720" w:footer="720" w:gutter="0"/>

</xml_diff>